<commit_message>
Remplace les rappels d'erreurs par des encadrés « Piège QCM »
Co-Authored-By: Claude Opus 5.5 <noreply@anthropic.com>
Claude-Session: https://claude.ai/code/session_01BLX92GY3uu5vfT1kGMzFQx
</commit_message>
<xml_diff>
--- a/droit-des-affaires/Droit_des_affaires_cours_complet.docx
+++ b/droit-des-affaires/Droit_des_affaires_cours_complet.docx
@@ -2502,7 +2502,7 @@
                 <w:bCs/>
                 <w:color w:val="7F7F7F"/>
               </w:rPr>
-              <w:t xml:space="preserve">Remarque du professeur</w:t>
+              <w:t xml:space="preserve">Piège QCM</w:t>
             </w:r>
           </w:p>
           <w:p>
@@ -2510,17 +2510,26 @@
               <w:spacing w:after="120"/>
             </w:pPr>
             <w:r>
-              <w:t xml:space="preserve">Dans vos notes, la définition « ensemble des règles juridiques qui encadrent les activités économiques et leurs acteurs » était attribuée au droit commercial. D'après la slide, c'est la définition du </w:t>
-            </w:r>
-            <w:r>
-              <w:rPr>
-                <w:b/>
-                <w:bCs/>
+              <w:t xml:space="preserve">La définition « ensemble des règles juridiques qui encadrent les activités économiques et leurs acteurs » est celle du </w:t>
+            </w:r>
+            <w:r>
+              <w:rPr>
+                <w:highlight w:val="yellow"/>
               </w:rPr>
               <w:t xml:space="preserve">droit des affaires</w:t>
             </w:r>
             <w:r>
-              <w:t xml:space="preserve">. Le droit commercial n'en est qu'une partie.</w:t>
+              <w:t xml:space="preserve">, </w:t>
+            </w:r>
+            <w:r>
+              <w:rPr>
+                <w:b/>
+                <w:bCs/>
+              </w:rPr>
+              <w:t xml:space="preserve">pas du droit commercial</w:t>
+            </w:r>
+            <w:r>
+              <w:t xml:space="preserve">. Le droit commercial n'en est qu'une partie (commerçants et actes de commerce).</w:t>
             </w:r>
           </w:p>
         </w:tc>
@@ -10818,7 +10827,7 @@
                 <w:bCs/>
                 <w:color w:val="7F7F7F"/>
               </w:rPr>
-              <w:t xml:space="preserve">Remarque du professeur</w:t>
+              <w:t xml:space="preserve">Piège QCM</w:t>
             </w:r>
           </w:p>
           <w:p>
@@ -10826,12 +10835,11 @@
               <w:spacing w:after="120"/>
             </w:pPr>
             <w:r>
-              <w:t xml:space="preserve">Dans vos notes, vous aviez écrit « autorisation de ses responsables légaux ». Attention : d'après l'article L.121-2, l'autorisation vient </w:t>
-            </w:r>
-            <w:r>
-              <w:rPr>
-                <w:b/>
-                <w:bCs/>
+              <w:t xml:space="preserve">L'autorisation du mineur émancipé vient </w:t>
+            </w:r>
+            <w:r>
+              <w:rPr>
+                <w:highlight w:val="yellow"/>
               </w:rPr>
               <w:t xml:space="preserve">d'un juge</w:t>
             </w:r>
@@ -10846,7 +10854,7 @@
               <w:t xml:space="preserve">pas des parents</w:t>
             </w:r>
             <w:r>
-              <w:t xml:space="preserve">.</w:t>
+              <w:t xml:space="preserve"> ni des responsables légaux (art. L.121-2).</w:t>
             </w:r>
           </w:p>
           <w:p>
@@ -15314,7 +15322,7 @@
                 <w:bCs/>
                 <w:color w:val="7F7F7F"/>
               </w:rPr>
-              <w:t xml:space="preserve">Correction de vos notes</w:t>
+              <w:t xml:space="preserve">Piège QCM</w:t>
             </w:r>
           </w:p>
           <w:p>
@@ -15322,17 +15330,7 @@
               <w:spacing w:after="120"/>
             </w:pPr>
             <w:r>
-              <w:t xml:space="preserve">Vous aviez noté « bien meuble </w:t>
-            </w:r>
-            <w:r>
-              <w:rPr>
-                <w:b/>
-                <w:bCs/>
-              </w:rPr>
-              <w:t xml:space="preserve">matériel</w:t>
-            </w:r>
-            <w:r>
-              <w:t xml:space="preserve"> ». Les slides le confirment : le fonds de commerce est un </w:t>
+              <w:t xml:space="preserve">Le fonds de commerce est un </w:t>
             </w:r>
             <w:r>
               <w:rPr>
@@ -15341,7 +15339,17 @@
               <w:t xml:space="preserve">bien meuble incorporel</w:t>
             </w:r>
             <w:r>
-              <w:t xml:space="preserve">. C'est un point classique de QCM.</w:t>
+              <w:t xml:space="preserve">, </w:t>
+            </w:r>
+            <w:r>
+              <w:rPr>
+                <w:b/>
+                <w:bCs/>
+              </w:rPr>
+              <w:t xml:space="preserve">pas un bien meuble matériel</w:t>
+            </w:r>
+            <w:r>
+              <w:t xml:space="preserve"> (ni un immeuble), même si certains de ses éléments, comme le matériel et les marchandises, sont corporels.</w:t>
             </w:r>
           </w:p>
         </w:tc>
@@ -20173,29 +20181,96 @@
         <w:t xml:space="preserve"> des négociations.</w:t>
       </w:r>
     </w:p>
-    <w:p>
-      <w:pPr>
-        <w:spacing w:after="120"/>
-      </w:pPr>
-      <w:r>
-        <w:rPr>
-          <w:i/>
-          <w:iCs/>
-        </w:rPr>
-        <w:t xml:space="preserve">Vos notes : « Responsabilité civile / pénale ».</w:t>
-      </w:r>
-      <w:r>
-        <w:t xml:space="preserve"> Les slides précisent qu'il s'agit de la </w:t>
-      </w:r>
-      <w:r>
-        <w:rPr>
-          <w:highlight w:val="yellow"/>
-        </w:rPr>
-        <w:t xml:space="preserve">responsabilité civile</w:t>
-      </w:r>
-      <w:r>
-        <w:t xml:space="preserve"> : la partie fautive doit réparer le préjudice causé. Il n'est pas question de responsabilité pénale ici.</w:t>
-      </w:r>
+    <w:tbl>
+      <w:tblPr>
+        <w:tblW w:type="dxa" w:w="9638"/>
+        <w:tblBorders>
+          <w:top w:val="single" w:color="auto" w:sz="4"/>
+          <w:left w:val="single" w:color="auto" w:sz="4"/>
+          <w:bottom w:val="single" w:color="auto" w:sz="4"/>
+          <w:right w:val="single" w:color="auto" w:sz="4"/>
+          <w:insideH w:val="single" w:color="auto" w:sz="4"/>
+          <w:insideV w:val="single" w:color="auto" w:sz="4"/>
+        </w:tblBorders>
+      </w:tblPr>
+      <w:tblGrid>
+        <w:gridCol w:w="9638"/>
+      </w:tblGrid>
+      <w:tr>
+        <w:tc>
+          <w:tcPr>
+            <w:tcW w:type="dxa" w:w="9638"/>
+            <w:tcBorders>
+              <w:top w:val="single" w:color="7F7F7F" w:sz="4"/>
+              <w:left w:val="single" w:color="7F7F7F" w:sz="24"/>
+              <w:bottom w:val="single" w:color="7F7F7F" w:sz="4"/>
+              <w:right w:val="single" w:color="7F7F7F" w:sz="4"/>
+            </w:tcBorders>
+            <w:shd w:fill="F2F2F2" w:color="auto" w:val="clear"/>
+            <w:tcMar>
+              <w:top w:type="dxa" w:w="120"/>
+              <w:left w:type="dxa" w:w="180"/>
+              <w:bottom w:type="dxa" w:w="80"/>
+              <w:right w:type="dxa" w:w="180"/>
+            </w:tcMar>
+          </w:tcPr>
+          <w:p>
+            <w:pPr>
+              <w:spacing w:after="80"/>
+            </w:pPr>
+            <w:r>
+              <w:rPr>
+                <w:b/>
+                <w:bCs/>
+                <w:color w:val="7F7F7F"/>
+              </w:rPr>
+              <w:t xml:space="preserve">Piège QCM</w:t>
+            </w:r>
+          </w:p>
+          <w:p>
+            <w:pPr>
+              <w:spacing w:after="120"/>
+            </w:pPr>
+            <w:r>
+              <w:t xml:space="preserve">La rupture fautive des négociations engage la </w:t>
+            </w:r>
+            <w:r>
+              <w:rPr>
+                <w:highlight w:val="yellow"/>
+              </w:rPr>
+              <w:t xml:space="preserve">responsabilité civile</w:t>
+            </w:r>
+            <w:r>
+              <w:t xml:space="preserve"> : la partie fautive doit réparer le préjudice causé. Il n'est </w:t>
+            </w:r>
+            <w:r>
+              <w:rPr>
+                <w:b/>
+                <w:bCs/>
+              </w:rPr>
+              <w:t xml:space="preserve">pas</w:t>
+            </w:r>
+            <w:r>
+              <w:t xml:space="preserve"> question de responsabilité </w:t>
+            </w:r>
+            <w:r>
+              <w:rPr>
+                <w:b/>
+                <w:bCs/>
+              </w:rPr>
+              <w:t xml:space="preserve">pénale</w:t>
+            </w:r>
+            <w:r>
+              <w:t xml:space="preserve">.</w:t>
+            </w:r>
+          </w:p>
+        </w:tc>
+      </w:tr>
+    </w:tbl>
+    <w:p>
+      <w:pPr>
+        <w:spacing w:after="60"/>
+      </w:pPr>
     </w:p>
     <w:tbl>
       <w:tblPr>

</xml_diff>